<commit_message>
Add daily reports for 2026-08-15 through 08-17; reissue 08-18 through 08-20 with unified register
One report per day per coordinator's direction. Chain-fall incident follow-ups
added as register items 32-36 (from the 08-16 incident review); tower-program
items renumbered 37-46 so the register is consistent across all reports.

Co-Authored-By: Claude Fable 5 <noreply@anthropic.com>
Claude-Session: https://claude.ai/code/session_019UGpM3ZDPErkHojPtkGGy9
</commit_message>
<xml_diff>
--- a/reports/Titan2_Daily_Report_2026-08-18.docx
+++ b/reports/Titan2_Daily_Report_2026-08-18.docx
@@ -4363,7 +4363,7 @@
                 <w:sz w:val="19"/>
                 <w:szCs w:val="19"/>
               </w:rPr>
-              <w:t xml:space="preserve">Send the follow-up email summarizing the 08-18 tower meeting — confirmed tower sequence, decisions, contacts, and handoff expectations — to all stakeholders.</w:t>
+              <w:t xml:space="preserve">Chain fall incident (08-16) — locate the other broken chain link and deliver it to the safety department for a full inspection.</w:t>
             </w:r>
           </w:p>
         </w:tc>
@@ -4386,7 +4386,7 @@
                 <w:sz w:val="19"/>
                 <w:szCs w:val="19"/>
               </w:rPr>
-              <w:t xml:space="preserve">Towers</w:t>
+              <w:t xml:space="preserve">Safety</w:t>
             </w:r>
           </w:p>
         </w:tc>
@@ -4409,7 +4409,7 @@
                 <w:sz w:val="19"/>
                 <w:szCs w:val="19"/>
               </w:rPr>
-              <w:t xml:space="preserve">Coordinator</w:t>
+              <w:t xml:space="preserve">Coordinator / Safety</w:t>
             </w:r>
           </w:p>
         </w:tc>
@@ -4432,7 +4432,7 @@
                 <w:sz w:val="19"/>
                 <w:szCs w:val="19"/>
               </w:rPr>
-              <w:t xml:space="preserve">Due 08-18</w:t>
+              <w:t xml:space="preserve">Open</w:t>
             </w:r>
           </w:p>
         </w:tc>
@@ -4480,7 +4480,7 @@
                 <w:sz w:val="19"/>
                 <w:szCs w:val="19"/>
               </w:rPr>
-              <w:t xml:space="preserve">Organize the 08-24 onsite kickoff (16:00 CT) and confirm every night-shift contractor has completed both the general and MPLX-specific orientations.</w:t>
+              <w:t xml:space="preserve">Obtain and file a picture of the chain fall operator's card (Alexander).</w:t>
             </w:r>
           </w:p>
         </w:tc>
@@ -4503,7 +4503,7 @@
                 <w:sz w:val="19"/>
                 <w:szCs w:val="19"/>
               </w:rPr>
-              <w:t xml:space="preserve">Towers</w:t>
+              <w:t xml:space="preserve">Safety</w:t>
             </w:r>
           </w:p>
         </w:tc>
@@ -4549,7 +4549,7 @@
                 <w:sz w:val="19"/>
                 <w:szCs w:val="19"/>
               </w:rPr>
-              <w:t xml:space="preserve">Due 08-24</w:t>
+              <w:t xml:space="preserve">Open</w:t>
             </w:r>
           </w:p>
         </w:tc>
@@ -4597,7 +4597,7 @@
                 <w:sz w:val="19"/>
                 <w:szCs w:val="19"/>
               </w:rPr>
-              <w:t xml:space="preserve">Identify, order, and stage the cool gaskets on site for the tower manway closures.</w:t>
+              <w:t xml:space="preserve">Confirm outcomes from the full-site stand-down, including any new company-wide policies or procedural updates.</w:t>
             </w:r>
           </w:p>
         </w:tc>
@@ -4620,7 +4620,7 @@
                 <w:sz w:val="19"/>
                 <w:szCs w:val="19"/>
               </w:rPr>
-              <w:t xml:space="preserve">Towers</w:t>
+              <w:t xml:space="preserve">Safety</w:t>
             </w:r>
           </w:p>
         </w:tc>
@@ -4643,7 +4643,7 @@
                 <w:sz w:val="19"/>
                 <w:szCs w:val="19"/>
               </w:rPr>
-              <w:t xml:space="preserve">Coordinator</w:t>
+              <w:t xml:space="preserve">Coordinator / Safety</w:t>
             </w:r>
           </w:p>
         </w:tc>
@@ -4666,7 +4666,7 @@
                 <w:sz w:val="19"/>
                 <w:szCs w:val="19"/>
               </w:rPr>
-              <w:t xml:space="preserve">Due 08-23</w:t>
+              <w:t xml:space="preserve">Open</w:t>
             </w:r>
           </w:p>
         </w:tc>
@@ -4714,7 +4714,7 @@
                 <w:sz w:val="19"/>
                 <w:szCs w:val="19"/>
               </w:rPr>
-              <w:t xml:space="preserve">Legacy — rescue plan for each tower entry (by 08-23) and ventilation pulling air through the towers (by 08-22); Sam to produce the ventilation plan diagram and coordinate installation with the scaffold builders.</w:t>
+              <w:t xml:space="preserve">Define controls to prevent accidental grinder strikes on lifting equipment (storage, marking, proximity controls, training).</w:t>
             </w:r>
           </w:p>
         </w:tc>
@@ -4737,7 +4737,7 @@
                 <w:sz w:val="19"/>
                 <w:szCs w:val="19"/>
               </w:rPr>
-              <w:t xml:space="preserve">Towers</w:t>
+              <w:t xml:space="preserve">Safety</w:t>
             </w:r>
           </w:p>
         </w:tc>
@@ -4760,7 +4760,7 @@
                 <w:sz w:val="19"/>
                 <w:szCs w:val="19"/>
               </w:rPr>
-              <w:t xml:space="preserve">Legacy / Sam</w:t>
+              <w:t xml:space="preserve">Safety / Supervisors</w:t>
             </w:r>
           </w:p>
         </w:tc>
@@ -4831,7 +4831,7 @@
                 <w:sz w:val="19"/>
                 <w:szCs w:val="19"/>
               </w:rPr>
-              <w:t xml:space="preserve">Arrange the day-shift rescue standby for WICK entries; plan rigging for up to three towers at once; if scaffolding finishes early, schedule rescue rigging 08-21 to 08-23.</w:t>
+              <w:t xml:space="preserve">Inspect the chain fall that has been hanging in the rack for two to three months — tag, certify, or remove it from service.</w:t>
             </w:r>
           </w:p>
         </w:tc>
@@ -4854,7 +4854,7 @@
                 <w:sz w:val="19"/>
                 <w:szCs w:val="19"/>
               </w:rPr>
-              <w:t xml:space="preserve">Towers</w:t>
+              <w:t xml:space="preserve">Safety</w:t>
             </w:r>
           </w:p>
         </w:tc>
@@ -4877,7 +4877,7 @@
                 <w:sz w:val="19"/>
                 <w:szCs w:val="19"/>
               </w:rPr>
-              <w:t xml:space="preserve">Coordinator / Legacy</w:t>
+              <w:t xml:space="preserve">Supervisors</w:t>
             </w:r>
           </w:p>
         </w:tc>
@@ -4948,7 +4948,7 @@
                 <w:sz w:val="19"/>
                 <w:szCs w:val="19"/>
               </w:rPr>
-              <w:t xml:space="preserve">Recheck the quote and status for the manway covers and provide it to Manny.</w:t>
+              <w:t xml:space="preserve">Send the follow-up email summarizing the 08-18 tower meeting — confirmed tower sequence, decisions, contacts, and handoff expectations — to all stakeholders.</w:t>
             </w:r>
           </w:p>
         </w:tc>
@@ -4994,7 +4994,7 @@
                 <w:sz w:val="19"/>
                 <w:szCs w:val="19"/>
               </w:rPr>
-              <w:t xml:space="preserve">Chris Snyder</w:t>
+              <w:t xml:space="preserve">Coordinator</w:t>
             </w:r>
           </w:p>
         </w:tc>
@@ -5017,7 +5017,7 @@
                 <w:sz w:val="19"/>
                 <w:szCs w:val="19"/>
               </w:rPr>
-              <w:t xml:space="preserve">Due 08-21</w:t>
+              <w:t xml:space="preserve">Due 08-18</w:t>
             </w:r>
           </w:p>
         </w:tc>
@@ -5065,7 +5065,7 @@
                 <w:sz w:val="19"/>
                 <w:szCs w:val="19"/>
               </w:rPr>
-              <w:t xml:space="preserve">Provide Gallup the internal drawings for the remaining columns and obtain the tower manufacturer contact information for issue mitigation.</w:t>
+              <w:t xml:space="preserve">Organize the 08-24 onsite kickoff (16:00 CT) and confirm every night-shift contractor has completed both the general and MPLX-specific orientations.</w:t>
             </w:r>
           </w:p>
         </w:tc>
@@ -5111,7 +5111,7 @@
                 <w:sz w:val="19"/>
                 <w:szCs w:val="19"/>
               </w:rPr>
-              <w:t xml:space="preserve">Coordinator / Project team</w:t>
+              <w:t xml:space="preserve">Coordinator</w:t>
             </w:r>
           </w:p>
         </w:tc>
@@ -5182,7 +5182,7 @@
                 <w:sz w:val="19"/>
                 <w:szCs w:val="19"/>
               </w:rPr>
-              <w:t xml:space="preserve">Distribute the pre-filled SIF/ship templates to Gallup and Safety for contacts and work steps.</w:t>
+              <w:t xml:space="preserve">Identify, order, and stage the cool gaskets on site for the tower manway closures.</w:t>
             </w:r>
           </w:p>
         </w:tc>
@@ -5228,7 +5228,7 @@
                 <w:sz w:val="19"/>
                 <w:szCs w:val="19"/>
               </w:rPr>
-              <w:t xml:space="preserve">Manny / Gallup / Safety</w:t>
+              <w:t xml:space="preserve">Coordinator</w:t>
             </w:r>
           </w:p>
         </w:tc>
@@ -5251,7 +5251,7 @@
                 <w:sz w:val="19"/>
                 <w:szCs w:val="19"/>
               </w:rPr>
-              <w:t xml:space="preserve">Due 08-22</w:t>
+              <w:t xml:space="preserve">Due 08-23</w:t>
             </w:r>
           </w:p>
         </w:tc>
@@ -5299,7 +5299,7 @@
                 <w:sz w:val="19"/>
                 <w:szCs w:val="19"/>
               </w:rPr>
-              <w:t xml:space="preserve">Run the nightly/evening handoff meetings (Gallup nights to WICK days) with the clean-and-close status per vessel; publish the daily deficiency list and the first/second/third-call contact chain to all teams.</w:t>
+              <w:t xml:space="preserve">Legacy — rescue plan for each tower entry (by 08-23) and ventilation pulling air through the towers (by 08-22); Sam to produce the ventilation plan diagram and coordinate installation with the scaffold builders.</w:t>
             </w:r>
           </w:p>
         </w:tc>
@@ -5345,7 +5345,7 @@
                 <w:sz w:val="19"/>
                 <w:szCs w:val="19"/>
               </w:rPr>
-              <w:t xml:space="preserve">Coordinator / Manny</w:t>
+              <w:t xml:space="preserve">Legacy / Sam</w:t>
             </w:r>
           </w:p>
         </w:tc>
@@ -5394,6 +5394,591 @@
                 <w:szCs w:val="19"/>
               </w:rPr>
               <w:t xml:space="preserve">41</w:t>
+            </w:r>
+          </w:p>
+        </w:tc>
+        <w:tc>
+          <w:tcPr>
+            <w:tcW w:type="dxa" w:w="5000"/>
+            <w:tcMar>
+              <w:top w:type="dxa" w:w="60"/>
+              <w:left w:type="dxa" w:w="100"/>
+              <w:bottom w:type="dxa" w:w="60"/>
+              <w:right w:type="dxa" w:w="100"/>
+            </w:tcMar>
+          </w:tcPr>
+          <w:p>
+            <w:r>
+              <w:rPr>
+                <w:b w:val="false"/>
+                <w:bCs w:val="false"/>
+                <w:color w:val="23211C"/>
+                <w:sz w:val="19"/>
+                <w:szCs w:val="19"/>
+              </w:rPr>
+              <w:t xml:space="preserve">Arrange the day-shift rescue standby for WICK entries; plan rigging for up to three towers at once; if scaffolding finishes early, schedule rescue rigging 08-21 to 08-23.</w:t>
+            </w:r>
+          </w:p>
+        </w:tc>
+        <w:tc>
+          <w:tcPr>
+            <w:tcW w:type="dxa" w:w="1300"/>
+            <w:tcMar>
+              <w:top w:type="dxa" w:w="60"/>
+              <w:left w:type="dxa" w:w="100"/>
+              <w:bottom w:type="dxa" w:w="60"/>
+              <w:right w:type="dxa" w:w="100"/>
+            </w:tcMar>
+          </w:tcPr>
+          <w:p>
+            <w:r>
+              <w:rPr>
+                <w:b w:val="false"/>
+                <w:bCs w:val="false"/>
+                <w:color w:val="23211C"/>
+                <w:sz w:val="19"/>
+                <w:szCs w:val="19"/>
+              </w:rPr>
+              <w:t xml:space="preserve">Towers</w:t>
+            </w:r>
+          </w:p>
+        </w:tc>
+        <w:tc>
+          <w:tcPr>
+            <w:tcW w:type="dxa" w:w="1800"/>
+            <w:tcMar>
+              <w:top w:type="dxa" w:w="60"/>
+              <w:left w:type="dxa" w:w="100"/>
+              <w:bottom w:type="dxa" w:w="60"/>
+              <w:right w:type="dxa" w:w="100"/>
+            </w:tcMar>
+          </w:tcPr>
+          <w:p>
+            <w:r>
+              <w:rPr>
+                <w:b w:val="false"/>
+                <w:bCs w:val="false"/>
+                <w:color w:val="23211C"/>
+                <w:sz w:val="19"/>
+                <w:szCs w:val="19"/>
+              </w:rPr>
+              <w:t xml:space="preserve">Coordinator / Legacy</w:t>
+            </w:r>
+          </w:p>
+        </w:tc>
+        <w:tc>
+          <w:tcPr>
+            <w:tcW w:type="dxa" w:w="1200"/>
+            <w:tcMar>
+              <w:top w:type="dxa" w:w="60"/>
+              <w:left w:type="dxa" w:w="100"/>
+              <w:bottom w:type="dxa" w:w="60"/>
+              <w:right w:type="dxa" w:w="100"/>
+            </w:tcMar>
+          </w:tcPr>
+          <w:p>
+            <w:r>
+              <w:rPr>
+                <w:b/>
+                <w:bCs/>
+                <w:color w:val="9A6700"/>
+                <w:sz w:val="19"/>
+                <w:szCs w:val="19"/>
+              </w:rPr>
+              <w:t xml:space="preserve">Open</w:t>
+            </w:r>
+          </w:p>
+        </w:tc>
+      </w:tr>
+      <w:tr>
+        <w:tc>
+          <w:tcPr>
+            <w:tcW w:type="dxa" w:w="500"/>
+            <w:tcMar>
+              <w:top w:type="dxa" w:w="60"/>
+              <w:left w:type="dxa" w:w="100"/>
+              <w:bottom w:type="dxa" w:w="60"/>
+              <w:right w:type="dxa" w:w="100"/>
+            </w:tcMar>
+          </w:tcPr>
+          <w:p>
+            <w:r>
+              <w:rPr>
+                <w:b w:val="false"/>
+                <w:bCs w:val="false"/>
+                <w:color w:val="6E6A60"/>
+                <w:sz w:val="19"/>
+                <w:szCs w:val="19"/>
+              </w:rPr>
+              <w:t xml:space="preserve">42</w:t>
+            </w:r>
+          </w:p>
+        </w:tc>
+        <w:tc>
+          <w:tcPr>
+            <w:tcW w:type="dxa" w:w="5000"/>
+            <w:tcMar>
+              <w:top w:type="dxa" w:w="60"/>
+              <w:left w:type="dxa" w:w="100"/>
+              <w:bottom w:type="dxa" w:w="60"/>
+              <w:right w:type="dxa" w:w="100"/>
+            </w:tcMar>
+          </w:tcPr>
+          <w:p>
+            <w:r>
+              <w:rPr>
+                <w:b w:val="false"/>
+                <w:bCs w:val="false"/>
+                <w:color w:val="23211C"/>
+                <w:sz w:val="19"/>
+                <w:szCs w:val="19"/>
+              </w:rPr>
+              <w:t xml:space="preserve">Recheck the quote and status for the manway covers and provide it to Manny.</w:t>
+            </w:r>
+          </w:p>
+        </w:tc>
+        <w:tc>
+          <w:tcPr>
+            <w:tcW w:type="dxa" w:w="1300"/>
+            <w:tcMar>
+              <w:top w:type="dxa" w:w="60"/>
+              <w:left w:type="dxa" w:w="100"/>
+              <w:bottom w:type="dxa" w:w="60"/>
+              <w:right w:type="dxa" w:w="100"/>
+            </w:tcMar>
+          </w:tcPr>
+          <w:p>
+            <w:r>
+              <w:rPr>
+                <w:b w:val="false"/>
+                <w:bCs w:val="false"/>
+                <w:color w:val="23211C"/>
+                <w:sz w:val="19"/>
+                <w:szCs w:val="19"/>
+              </w:rPr>
+              <w:t xml:space="preserve">Towers</w:t>
+            </w:r>
+          </w:p>
+        </w:tc>
+        <w:tc>
+          <w:tcPr>
+            <w:tcW w:type="dxa" w:w="1800"/>
+            <w:tcMar>
+              <w:top w:type="dxa" w:w="60"/>
+              <w:left w:type="dxa" w:w="100"/>
+              <w:bottom w:type="dxa" w:w="60"/>
+              <w:right w:type="dxa" w:w="100"/>
+            </w:tcMar>
+          </w:tcPr>
+          <w:p>
+            <w:r>
+              <w:rPr>
+                <w:b w:val="false"/>
+                <w:bCs w:val="false"/>
+                <w:color w:val="23211C"/>
+                <w:sz w:val="19"/>
+                <w:szCs w:val="19"/>
+              </w:rPr>
+              <w:t xml:space="preserve">Chris Snyder</w:t>
+            </w:r>
+          </w:p>
+        </w:tc>
+        <w:tc>
+          <w:tcPr>
+            <w:tcW w:type="dxa" w:w="1200"/>
+            <w:tcMar>
+              <w:top w:type="dxa" w:w="60"/>
+              <w:left w:type="dxa" w:w="100"/>
+              <w:bottom w:type="dxa" w:w="60"/>
+              <w:right w:type="dxa" w:w="100"/>
+            </w:tcMar>
+          </w:tcPr>
+          <w:p>
+            <w:r>
+              <w:rPr>
+                <w:b/>
+                <w:bCs/>
+                <w:color w:val="9A6700"/>
+                <w:sz w:val="19"/>
+                <w:szCs w:val="19"/>
+              </w:rPr>
+              <w:t xml:space="preserve">Due 08-21</w:t>
+            </w:r>
+          </w:p>
+        </w:tc>
+      </w:tr>
+      <w:tr>
+        <w:tc>
+          <w:tcPr>
+            <w:tcW w:type="dxa" w:w="500"/>
+            <w:tcMar>
+              <w:top w:type="dxa" w:w="60"/>
+              <w:left w:type="dxa" w:w="100"/>
+              <w:bottom w:type="dxa" w:w="60"/>
+              <w:right w:type="dxa" w:w="100"/>
+            </w:tcMar>
+          </w:tcPr>
+          <w:p>
+            <w:r>
+              <w:rPr>
+                <w:b w:val="false"/>
+                <w:bCs w:val="false"/>
+                <w:color w:val="6E6A60"/>
+                <w:sz w:val="19"/>
+                <w:szCs w:val="19"/>
+              </w:rPr>
+              <w:t xml:space="preserve">43</w:t>
+            </w:r>
+          </w:p>
+        </w:tc>
+        <w:tc>
+          <w:tcPr>
+            <w:tcW w:type="dxa" w:w="5000"/>
+            <w:tcMar>
+              <w:top w:type="dxa" w:w="60"/>
+              <w:left w:type="dxa" w:w="100"/>
+              <w:bottom w:type="dxa" w:w="60"/>
+              <w:right w:type="dxa" w:w="100"/>
+            </w:tcMar>
+          </w:tcPr>
+          <w:p>
+            <w:r>
+              <w:rPr>
+                <w:b w:val="false"/>
+                <w:bCs w:val="false"/>
+                <w:color w:val="23211C"/>
+                <w:sz w:val="19"/>
+                <w:szCs w:val="19"/>
+              </w:rPr>
+              <w:t xml:space="preserve">Provide Gallup the internal drawings for the remaining columns and obtain the tower manufacturer contact information for issue mitigation.</w:t>
+            </w:r>
+          </w:p>
+        </w:tc>
+        <w:tc>
+          <w:tcPr>
+            <w:tcW w:type="dxa" w:w="1300"/>
+            <w:tcMar>
+              <w:top w:type="dxa" w:w="60"/>
+              <w:left w:type="dxa" w:w="100"/>
+              <w:bottom w:type="dxa" w:w="60"/>
+              <w:right w:type="dxa" w:w="100"/>
+            </w:tcMar>
+          </w:tcPr>
+          <w:p>
+            <w:r>
+              <w:rPr>
+                <w:b w:val="false"/>
+                <w:bCs w:val="false"/>
+                <w:color w:val="23211C"/>
+                <w:sz w:val="19"/>
+                <w:szCs w:val="19"/>
+              </w:rPr>
+              <w:t xml:space="preserve">Towers</w:t>
+            </w:r>
+          </w:p>
+        </w:tc>
+        <w:tc>
+          <w:tcPr>
+            <w:tcW w:type="dxa" w:w="1800"/>
+            <w:tcMar>
+              <w:top w:type="dxa" w:w="60"/>
+              <w:left w:type="dxa" w:w="100"/>
+              <w:bottom w:type="dxa" w:w="60"/>
+              <w:right w:type="dxa" w:w="100"/>
+            </w:tcMar>
+          </w:tcPr>
+          <w:p>
+            <w:r>
+              <w:rPr>
+                <w:b w:val="false"/>
+                <w:bCs w:val="false"/>
+                <w:color w:val="23211C"/>
+                <w:sz w:val="19"/>
+                <w:szCs w:val="19"/>
+              </w:rPr>
+              <w:t xml:space="preserve">Coordinator / Project team</w:t>
+            </w:r>
+          </w:p>
+        </w:tc>
+        <w:tc>
+          <w:tcPr>
+            <w:tcW w:type="dxa" w:w="1200"/>
+            <w:tcMar>
+              <w:top w:type="dxa" w:w="60"/>
+              <w:left w:type="dxa" w:w="100"/>
+              <w:bottom w:type="dxa" w:w="60"/>
+              <w:right w:type="dxa" w:w="100"/>
+            </w:tcMar>
+          </w:tcPr>
+          <w:p>
+            <w:r>
+              <w:rPr>
+                <w:b/>
+                <w:bCs/>
+                <w:color w:val="9A6700"/>
+                <w:sz w:val="19"/>
+                <w:szCs w:val="19"/>
+              </w:rPr>
+              <w:t xml:space="preserve">Due 08-24</w:t>
+            </w:r>
+          </w:p>
+        </w:tc>
+      </w:tr>
+      <w:tr>
+        <w:tc>
+          <w:tcPr>
+            <w:tcW w:type="dxa" w:w="500"/>
+            <w:tcMar>
+              <w:top w:type="dxa" w:w="60"/>
+              <w:left w:type="dxa" w:w="100"/>
+              <w:bottom w:type="dxa" w:w="60"/>
+              <w:right w:type="dxa" w:w="100"/>
+            </w:tcMar>
+          </w:tcPr>
+          <w:p>
+            <w:r>
+              <w:rPr>
+                <w:b w:val="false"/>
+                <w:bCs w:val="false"/>
+                <w:color w:val="6E6A60"/>
+                <w:sz w:val="19"/>
+                <w:szCs w:val="19"/>
+              </w:rPr>
+              <w:t xml:space="preserve">44</w:t>
+            </w:r>
+          </w:p>
+        </w:tc>
+        <w:tc>
+          <w:tcPr>
+            <w:tcW w:type="dxa" w:w="5000"/>
+            <w:tcMar>
+              <w:top w:type="dxa" w:w="60"/>
+              <w:left w:type="dxa" w:w="100"/>
+              <w:bottom w:type="dxa" w:w="60"/>
+              <w:right w:type="dxa" w:w="100"/>
+            </w:tcMar>
+          </w:tcPr>
+          <w:p>
+            <w:r>
+              <w:rPr>
+                <w:b w:val="false"/>
+                <w:bCs w:val="false"/>
+                <w:color w:val="23211C"/>
+                <w:sz w:val="19"/>
+                <w:szCs w:val="19"/>
+              </w:rPr>
+              <w:t xml:space="preserve">Distribute the pre-filled SIF/ship templates to Gallup and Safety for contacts and work steps.</w:t>
+            </w:r>
+          </w:p>
+        </w:tc>
+        <w:tc>
+          <w:tcPr>
+            <w:tcW w:type="dxa" w:w="1300"/>
+            <w:tcMar>
+              <w:top w:type="dxa" w:w="60"/>
+              <w:left w:type="dxa" w:w="100"/>
+              <w:bottom w:type="dxa" w:w="60"/>
+              <w:right w:type="dxa" w:w="100"/>
+            </w:tcMar>
+          </w:tcPr>
+          <w:p>
+            <w:r>
+              <w:rPr>
+                <w:b w:val="false"/>
+                <w:bCs w:val="false"/>
+                <w:color w:val="23211C"/>
+                <w:sz w:val="19"/>
+                <w:szCs w:val="19"/>
+              </w:rPr>
+              <w:t xml:space="preserve">Towers</w:t>
+            </w:r>
+          </w:p>
+        </w:tc>
+        <w:tc>
+          <w:tcPr>
+            <w:tcW w:type="dxa" w:w="1800"/>
+            <w:tcMar>
+              <w:top w:type="dxa" w:w="60"/>
+              <w:left w:type="dxa" w:w="100"/>
+              <w:bottom w:type="dxa" w:w="60"/>
+              <w:right w:type="dxa" w:w="100"/>
+            </w:tcMar>
+          </w:tcPr>
+          <w:p>
+            <w:r>
+              <w:rPr>
+                <w:b w:val="false"/>
+                <w:bCs w:val="false"/>
+                <w:color w:val="23211C"/>
+                <w:sz w:val="19"/>
+                <w:szCs w:val="19"/>
+              </w:rPr>
+              <w:t xml:space="preserve">Manny / Gallup / Safety</w:t>
+            </w:r>
+          </w:p>
+        </w:tc>
+        <w:tc>
+          <w:tcPr>
+            <w:tcW w:type="dxa" w:w="1200"/>
+            <w:tcMar>
+              <w:top w:type="dxa" w:w="60"/>
+              <w:left w:type="dxa" w:w="100"/>
+              <w:bottom w:type="dxa" w:w="60"/>
+              <w:right w:type="dxa" w:w="100"/>
+            </w:tcMar>
+          </w:tcPr>
+          <w:p>
+            <w:r>
+              <w:rPr>
+                <w:b/>
+                <w:bCs/>
+                <w:color w:val="9A6700"/>
+                <w:sz w:val="19"/>
+                <w:szCs w:val="19"/>
+              </w:rPr>
+              <w:t xml:space="preserve">Due 08-22</w:t>
+            </w:r>
+          </w:p>
+        </w:tc>
+      </w:tr>
+      <w:tr>
+        <w:tc>
+          <w:tcPr>
+            <w:tcW w:type="dxa" w:w="500"/>
+            <w:tcMar>
+              <w:top w:type="dxa" w:w="60"/>
+              <w:left w:type="dxa" w:w="100"/>
+              <w:bottom w:type="dxa" w:w="60"/>
+              <w:right w:type="dxa" w:w="100"/>
+            </w:tcMar>
+          </w:tcPr>
+          <w:p>
+            <w:r>
+              <w:rPr>
+                <w:b w:val="false"/>
+                <w:bCs w:val="false"/>
+                <w:color w:val="6E6A60"/>
+                <w:sz w:val="19"/>
+                <w:szCs w:val="19"/>
+              </w:rPr>
+              <w:t xml:space="preserve">45</w:t>
+            </w:r>
+          </w:p>
+        </w:tc>
+        <w:tc>
+          <w:tcPr>
+            <w:tcW w:type="dxa" w:w="5000"/>
+            <w:tcMar>
+              <w:top w:type="dxa" w:w="60"/>
+              <w:left w:type="dxa" w:w="100"/>
+              <w:bottom w:type="dxa" w:w="60"/>
+              <w:right w:type="dxa" w:w="100"/>
+            </w:tcMar>
+          </w:tcPr>
+          <w:p>
+            <w:r>
+              <w:rPr>
+                <w:b w:val="false"/>
+                <w:bCs w:val="false"/>
+                <w:color w:val="23211C"/>
+                <w:sz w:val="19"/>
+                <w:szCs w:val="19"/>
+              </w:rPr>
+              <w:t xml:space="preserve">Run the nightly/evening handoff meetings (Gallup nights to WICK days) with the clean-and-close status per vessel; publish the daily deficiency list and the first/second/third-call contact chain to all teams.</w:t>
+            </w:r>
+          </w:p>
+        </w:tc>
+        <w:tc>
+          <w:tcPr>
+            <w:tcW w:type="dxa" w:w="1300"/>
+            <w:tcMar>
+              <w:top w:type="dxa" w:w="60"/>
+              <w:left w:type="dxa" w:w="100"/>
+              <w:bottom w:type="dxa" w:w="60"/>
+              <w:right w:type="dxa" w:w="100"/>
+            </w:tcMar>
+          </w:tcPr>
+          <w:p>
+            <w:r>
+              <w:rPr>
+                <w:b w:val="false"/>
+                <w:bCs w:val="false"/>
+                <w:color w:val="23211C"/>
+                <w:sz w:val="19"/>
+                <w:szCs w:val="19"/>
+              </w:rPr>
+              <w:t xml:space="preserve">Towers</w:t>
+            </w:r>
+          </w:p>
+        </w:tc>
+        <w:tc>
+          <w:tcPr>
+            <w:tcW w:type="dxa" w:w="1800"/>
+            <w:tcMar>
+              <w:top w:type="dxa" w:w="60"/>
+              <w:left w:type="dxa" w:w="100"/>
+              <w:bottom w:type="dxa" w:w="60"/>
+              <w:right w:type="dxa" w:w="100"/>
+            </w:tcMar>
+          </w:tcPr>
+          <w:p>
+            <w:r>
+              <w:rPr>
+                <w:b w:val="false"/>
+                <w:bCs w:val="false"/>
+                <w:color w:val="23211C"/>
+                <w:sz w:val="19"/>
+                <w:szCs w:val="19"/>
+              </w:rPr>
+              <w:t xml:space="preserve">Coordinator / Manny</w:t>
+            </w:r>
+          </w:p>
+        </w:tc>
+        <w:tc>
+          <w:tcPr>
+            <w:tcW w:type="dxa" w:w="1200"/>
+            <w:tcMar>
+              <w:top w:type="dxa" w:w="60"/>
+              <w:left w:type="dxa" w:w="100"/>
+              <w:bottom w:type="dxa" w:w="60"/>
+              <w:right w:type="dxa" w:w="100"/>
+            </w:tcMar>
+          </w:tcPr>
+          <w:p>
+            <w:r>
+              <w:rPr>
+                <w:b/>
+                <w:bCs/>
+                <w:color w:val="9A6700"/>
+                <w:sz w:val="19"/>
+                <w:szCs w:val="19"/>
+              </w:rPr>
+              <w:t xml:space="preserve">Open</w:t>
+            </w:r>
+          </w:p>
+        </w:tc>
+      </w:tr>
+      <w:tr>
+        <w:tc>
+          <w:tcPr>
+            <w:tcW w:type="dxa" w:w="500"/>
+            <w:tcMar>
+              <w:top w:type="dxa" w:w="60"/>
+              <w:left w:type="dxa" w:w="100"/>
+              <w:bottom w:type="dxa" w:w="60"/>
+              <w:right w:type="dxa" w:w="100"/>
+            </w:tcMar>
+          </w:tcPr>
+          <w:p>
+            <w:r>
+              <w:rPr>
+                <w:b w:val="false"/>
+                <w:bCs w:val="false"/>
+                <w:color w:val="6E6A60"/>
+                <w:sz w:val="19"/>
+                <w:szCs w:val="19"/>
+              </w:rPr>
+              <w:t xml:space="preserve">46</w:t>
             </w:r>
           </w:p>
         </w:tc>
@@ -5608,7 +6193,7 @@
           <w:sz w:val="18"/>
           <w:szCs w:val="18"/>
         </w:rPr>
-        <w:t xml:space="preserve">Compiled from the 08-18 Plaud recording of the tower inspection, cleaning, and closure coordination meeting, with the 08-16 incident-review recording (chain fall, safety stand-down) summarized in the coordinator note. Weather and crew counts were not recorded in the source notes. Register numbering continues the re-sequenced 1-31 register from DR-2026-08-14; new tower-program items are 32-41. Statuses on items 5-31 are carried from 08-14 — the 08-17 field recording has not been transcribed yet, so completions from Saturday through Monday are not yet reflected.</w:t>
+        <w:t xml:space="preserve">Compiled from the 08-18 Plaud recording of the tower inspection, cleaning, and closure coordination meeting, with the 08-16 incident-review recording (chain fall, safety stand-down) summarized in the coordinator note. Weather and crew counts were not recorded in the source notes. Register numbering continues the re-sequenced register from DR-2026-08-14: items 32-36 are the chain-fall incident follow-ups carried from DR-2026-08-16, and the new tower-program items are 37-46. Statuses on items 5-31 are carried from 08-14 — the 08-17 field recording has not been transcribed yet, so completions from Saturday through Monday are not yet reflected.</w:t>
       </w:r>
     </w:p>
     <w:sectPr>

</xml_diff>